<commit_message>
Atualizar relatório com as seções do Terminal Médico
</commit_message>
<xml_diff>
--- a/Relatório de Desenvolvimento - Pandemic Crysis.docx
+++ b/Relatório de Desenvolvimento - Pandemic Crysis.docx
@@ -230,31 +230,7 @@
         <w:rPr>
           <w:rtl w:val="0"/>
         </w:rPr>
-        <w:t xml:space="preserve">Calendário e Progressão (</w:t>
-      </w:r>
-      <w:r>
-        <w:rPr>
-          <w:rtl w:val="0"/>
-        </w:rPr>
-        <w:t xml:space="preserve">TimeManager</w:t>
-      </w:r>
-      <w:r>
-        <w:rPr>
-          <w:rtl w:val="0"/>
-        </w:rPr>
-        <w:t xml:space="preserve">): Controlador de tempo que avança os turnos diários e </w:t>
-      </w:r>
-      <w:r>
-        <w:rPr>
-          <w:rtl w:val="0"/>
-        </w:rPr>
-        <w:t xml:space="preserve">semanas</w:t>
-      </w:r>
-      <w:r>
-        <w:rPr>
-          <w:rtl w:val="0"/>
-        </w:rPr>
-        <w:t xml:space="preserve">. O sistema detecta o limite da campanha (21 dias) e emite os gatilhos automáticos para o início do clímax de pandemia global na 4ª semana.</w:t>
+        <w:t xml:space="preserve">Calendário e Progressão (TimeManager): Controlador de tempo que avança os turnos diários e semanas. O sistema detecta o limite da campanha (21 dias) e emite os gatilhos automáticos para o início do clímax de pandemia global na 4ª semana.</w:t>
       </w:r>
     </w:p>
     <w:p>
@@ -290,19 +266,7 @@
         <w:rPr>
           <w:rtl w:val="0"/>
         </w:rPr>
-        <w:t xml:space="preserve">A estrutura de transição de cenas foi iniciada utilizando nós de interface e conexões de sinais (</w:t>
-      </w:r>
-      <w:r>
-        <w:rPr>
-          <w:rtl w:val="0"/>
-        </w:rPr>
-        <w:t xml:space="preserve">Signals</w:t>
-      </w:r>
-      <w:r>
-        <w:rPr>
-          <w:rtl w:val="0"/>
-        </w:rPr>
-        <w:t xml:space="preserve">):</w:t>
+        <w:t xml:space="preserve">A estrutura de transição de cenas foi iniciada utilizando nós de interface e conexões de sinais (Signals):</w:t>
       </w:r>
     </w:p>
     <w:p>
@@ -360,19 +324,161 @@
         <w:rPr>
           <w:rtl w:val="0"/>
         </w:rPr>
-        <w:t xml:space="preserve">4. Próximos Passos Com a navegação base e os controladores lógicos prontos, a equipe </w:t>
-      </w:r>
-      <w:r>
-        <w:rPr>
-          <w:rtl w:val="0"/>
-        </w:rPr>
-        <w:t xml:space="preserve">focará</w:t>
-      </w:r>
-      <w:r>
-        <w:rPr>
-          <w:rtl w:val="0"/>
-        </w:rPr>
-        <w:t xml:space="preserve"> na construção visual do "Terminal Médico" (fase de triagem com análise de prontuários) e na "Loja do Hospital" (menu de melhorias e estatísticas do relatório diário).</w:t>
+        <w:t xml:space="preserve">4. Próximos Passos Com a navegação base e os controladores lógicos prontos, a equipe focará na construção visual do "Terminal Médico" (fase de triagem com análise de prontuários) e na "Loja do Hospital" (menu de melhorias e estatísticas do relatório diário).</w:t>
+      </w:r>
+    </w:p>
+    <w:p>
+      <w:pPr>
+        <w:spacing w:after="0" w:before="0" w:lineRule="auto"/>
+        <w:rPr/>
+      </w:pPr>
+      <w:r>
+        <w:rPr>
+          <w:rtl w:val="0"/>
+        </w:rPr>
+      </w:r>
+    </w:p>
+    <w:p>
+      <w:pPr>
+        <w:spacing w:after="240" w:before="240" w:lineRule="auto"/>
+        <w:rPr/>
+      </w:pPr>
+      <w:r>
+        <w:rPr>
+          <w:rtl w:val="0"/>
+        </w:rPr>
+        <w:t xml:space="preserve">5. Terminal Médico — Tela de Triagem</w:t>
+      </w:r>
+    </w:p>
+    <w:p>
+      <w:pPr>
+        <w:spacing w:after="240" w:before="240" w:lineRule="auto"/>
+        <w:rPr/>
+      </w:pPr>
+      <w:r>
+        <w:rPr>
+          <w:rtl w:val="0"/>
+        </w:rPr>
+        <w:t xml:space="preserve">Foi construída a tela principal de gameplay, onde ocorre o atendimento aos pacientes. A interface é composta integralmente por nós de interface organizados em contêineres, de modo a se adaptar a diferentes resoluções, e apresenta ao jogador o calendário corrente, o saldo do hospital e o andamento da meta diária, todos obtidos diretamente dos controladores globais.</w:t>
+      </w:r>
+    </w:p>
+    <w:p>
+      <w:pPr>
+        <w:spacing w:after="240" w:before="240" w:lineRule="auto"/>
+        <w:rPr/>
+      </w:pPr>
+      <w:r>
+        <w:rPr>
+          <w:rtl w:val="0"/>
+        </w:rPr>
+        <w:t xml:space="preserve">O prontuário é gerado de forma dinâmica: a cada atendimento o sistema sorteia uma patologia entre as cadastradas no banco de doenças e exibe os sintomas correspondentes, sem qualquer texto fixo na cena. O sorteio respeita a semana de aparição de cada enfermidade, de forma que as patologias reservadas ao clímax da pandemia permanecem indisponíveis até que a progressão do calendário as libere. A ordem de exibição dos sintomas é embaralhada a cada ficha, evitando que o jogador memorize a sequência em vez de interpretar o quadro clínico.</w:t>
+      </w:r>
+    </w:p>
+    <w:p>
+      <w:pPr>
+        <w:spacing w:after="240" w:before="240" w:lineRule="auto"/>
+        <w:rPr/>
+      </w:pPr>
+      <w:r>
+        <w:rPr>
+          <w:rtl w:val="0"/>
+        </w:rPr>
+        <w:t xml:space="preserve">Os botões de conduta médica também são criados em tempo de execução, um para cada patologia disponível no período, o que dispensa manutenção manual da interface conforme novas doenças forem cadastradas pela equipe.</w:t>
+      </w:r>
+    </w:p>
+    <w:p>
+      <w:pPr>
+        <w:spacing w:after="240" w:before="240" w:lineRule="auto"/>
+        <w:rPr/>
+      </w:pPr>
+      <w:r>
+        <w:rPr>
+          <w:rtl w:val="0"/>
+        </w:rPr>
+        <w:t xml:space="preserve">6. Integração com os Controladores Globais</w:t>
+      </w:r>
+    </w:p>
+    <w:p>
+      <w:pPr>
+        <w:spacing w:after="240" w:before="240" w:lineRule="auto"/>
+        <w:rPr/>
+      </w:pPr>
+      <w:r>
+        <w:rPr>
+          <w:rtl w:val="0"/>
+        </w:rPr>
+        <w:t xml:space="preserve">Nenhuma função dos controladores foi modificada para a construção desta tela; toda a comunicação ocorre por chamadas às funções públicas já existentes e pela escuta dos sinais previamente definidos. A confirmação de um diagnóstico aciona a rotina de triagem do GameManager, que compara a escolha do jogador com o quadro real e contabiliza acerto, erro e recompensa. O encerramento do expediente aciona o fechamento de caixa e, na sequência, encaminha o jogador à fase de gestão. O módulo permanece atento ao sinal de fim de jogo: caso a falência ou a interdição operacional sejam acionadas durante o fechamento, o roteamento é desviado para a tela de Game Over.</w:t>
+      </w:r>
+    </w:p>
+    <w:p>
+      <w:pPr>
+        <w:spacing w:after="240" w:before="240" w:lineRule="auto"/>
+        <w:rPr/>
+      </w:pPr>
+      <w:r>
+        <w:rPr>
+          <w:rtl w:val="0"/>
+        </w:rPr>
+        <w:t xml:space="preserve">A fase de gestão — relatório diário, loja de melhorias e avanço do calendário — não é implementada por esta tela, permanecendo sob responsabilidade do módulo seguinte. A transição foi construída de forma tolerante: enquanto a cena de gestão não estiver presente no projeto, a Triagem encerra o expediente na própria interface, sem interromper a execução, o que permitiu testar e validar este módulo de forma isolada.</w:t>
+      </w:r>
+    </w:p>
+    <w:p>
+      <w:pPr>
+        <w:spacing w:after="240" w:before="240" w:lineRule="auto"/>
+        <w:rPr/>
+      </w:pPr>
+      <w:r>
+        <w:rPr>
+          <w:rtl w:val="0"/>
+        </w:rPr>
+        <w:t xml:space="preserve">7. Ajustes Decorrentes dos Testes</w:t>
+      </w:r>
+    </w:p>
+    <w:p>
+      <w:pPr>
+        <w:spacing w:after="240" w:before="240" w:lineRule="auto"/>
+        <w:rPr/>
+      </w:pPr>
+      <w:r>
+        <w:rPr>
+          <w:rtl w:val="0"/>
+        </w:rPr>
+        <w:t xml:space="preserve">Os testes de jogabilidade revelaram que, como as regras vigentes estabelecem apenas um mínimo de atendimentos diários, o jogador podia atender pacientes indefinidamente no mesmo turno e acumular recursos sem contrapartida. Optou-se por encerrar a fila de espera ao atingir a meta do dia — uma decisão restrita à camada de interface, que preserva integralmente as regras de economia definidas nos controladores. Registra-se, para efeito de balanceamento futuro, que esse limite está atrelado à meta diária de pacientes.</w:t>
+      </w:r>
+    </w:p>
+    <w:p>
+      <w:pPr>
+        <w:spacing w:after="240" w:before="240" w:lineRule="auto"/>
+        <w:rPr/>
+      </w:pPr>
+      <w:r>
+        <w:rPr>
+          <w:rtl w:val="0"/>
+        </w:rPr>
+        <w:t xml:space="preserve">8. Pendências</w:t>
+      </w:r>
+    </w:p>
+    <w:p>
+      <w:pPr>
+        <w:spacing w:after="240" w:before="240" w:lineRule="auto"/>
+        <w:rPr/>
+      </w:pPr>
+      <w:r>
+        <w:rPr>
+          <w:rtl w:val="0"/>
+        </w:rPr>
+        <w:t xml:space="preserve">O cadastro de sintomas das patologias e a ampliação do banco de doenças permanecem em aberto e condicionam a variedade da fase de triagem. Prevê-se ainda o aproveitamento do bônus de velocidade de exame, já disponível nos controladores, como base para um cronômetro de expediente.</w:t>
+      </w:r>
+    </w:p>
+    <w:p>
+      <w:pPr>
+        <w:spacing w:after="0" w:before="0" w:lineRule="auto"/>
+        <w:rPr/>
+      </w:pPr>
+      <w:r>
+        <w:rPr>
+          <w:rtl w:val="0"/>
+        </w:rPr>
       </w:r>
     </w:p>
     <w:p>

</xml_diff>